<commit_message>
hoàn thiện dự án
</commit_message>
<xml_diff>
--- a/bao-cao-do-an/bao-cao/Bao_Cao.docx
+++ b/bao-cao-do-an/bao-cao/Bao_Cao.docx
@@ -8,8 +8,8 @@
         <w:jc w:val="center"/>
       </w:pPr>
       <w:bookmarkStart w:id="0" w:name="_Toc23156"/>
-      <w:bookmarkStart w:id="1" w:name="X9d25436f8da491202c298d42ca7c39da5878432"/>
-      <w:bookmarkStart w:id="2" w:name="X56d4395f1d5a1e93d9e5899ee041514ea4c0b31"/>
+      <w:bookmarkStart w:id="1" w:name="X56d4395f1d5a1e93d9e5899ee041514ea4c0b31"/>
+      <w:bookmarkStart w:id="2" w:name="X9d25436f8da491202c298d42ca7c39da5878432"/>
       <w:r>
         <w:rPr>
           <w:rFonts w:cs="Times New Roman"/>
@@ -2440,6 +2440,8 @@
         <w:spacing w:line="360" w:lineRule="auto"/>
         <w:ind w:left="480"/>
       </w:pPr>
+      <w:bookmarkStart w:id="170" w:name="_GoBack"/>
+      <w:bookmarkEnd w:id="170"/>
       <w:r>
         <w:fldChar w:fldCharType="begin"/>
       </w:r>
@@ -2560,7 +2562,7 @@
         <w:fldChar w:fldCharType="separate"/>
       </w:r>
       <w:r>
-        <w:t>22</w:t>
+        <w:t>21</w:t>
       </w:r>
       <w:r>
         <w:fldChar w:fldCharType="end"/>
@@ -2652,7 +2654,7 @@
         <w:fldChar w:fldCharType="separate"/>
       </w:r>
       <w:r>
-        <w:t>23</w:t>
+        <w:t>25</w:t>
       </w:r>
       <w:r>
         <w:fldChar w:fldCharType="end"/>
@@ -2698,7 +2700,7 @@
         <w:fldChar w:fldCharType="separate"/>
       </w:r>
       <w:r>
-        <w:t>23</w:t>
+        <w:t>25</w:t>
       </w:r>
       <w:r>
         <w:fldChar w:fldCharType="end"/>
@@ -2744,7 +2746,7 @@
         <w:fldChar w:fldCharType="separate"/>
       </w:r>
       <w:r>
-        <w:t>24</w:t>
+        <w:t>27</w:t>
       </w:r>
       <w:r>
         <w:fldChar w:fldCharType="end"/>
@@ -2790,7 +2792,7 @@
         <w:fldChar w:fldCharType="separate"/>
       </w:r>
       <w:r>
-        <w:t>25</w:t>
+        <w:t>28</w:t>
       </w:r>
       <w:r>
         <w:fldChar w:fldCharType="end"/>
@@ -2836,7 +2838,7 @@
         <w:fldChar w:fldCharType="separate"/>
       </w:r>
       <w:r>
-        <w:t>25</w:t>
+        <w:t>28</w:t>
       </w:r>
       <w:r>
         <w:fldChar w:fldCharType="end"/>
@@ -2882,7 +2884,7 @@
         <w:fldChar w:fldCharType="separate"/>
       </w:r>
       <w:r>
-        <w:t>25</w:t>
+        <w:t>28</w:t>
       </w:r>
       <w:r>
         <w:fldChar w:fldCharType="end"/>
@@ -2928,7 +2930,7 @@
         <w:fldChar w:fldCharType="separate"/>
       </w:r>
       <w:r>
-        <w:t>25</w:t>
+        <w:t>28</w:t>
       </w:r>
       <w:r>
         <w:fldChar w:fldCharType="end"/>
@@ -2974,7 +2976,7 @@
         <w:fldChar w:fldCharType="separate"/>
       </w:r>
       <w:r>
-        <w:t>26</w:t>
+        <w:t>29</w:t>
       </w:r>
       <w:r>
         <w:fldChar w:fldCharType="end"/>
@@ -3020,7 +3022,7 @@
         <w:fldChar w:fldCharType="separate"/>
       </w:r>
       <w:r>
-        <w:t>26</w:t>
+        <w:t>29</w:t>
       </w:r>
       <w:r>
         <w:fldChar w:fldCharType="end"/>
@@ -3066,7 +3068,7 @@
         <w:fldChar w:fldCharType="separate"/>
       </w:r>
       <w:r>
-        <w:t>28</w:t>
+        <w:t>31</w:t>
       </w:r>
       <w:r>
         <w:fldChar w:fldCharType="end"/>
@@ -3112,7 +3114,7 @@
         <w:fldChar w:fldCharType="separate"/>
       </w:r>
       <w:r>
-        <w:t>29</w:t>
+        <w:t>32</w:t>
       </w:r>
       <w:r>
         <w:fldChar w:fldCharType="end"/>
@@ -3158,7 +3160,7 @@
         <w:fldChar w:fldCharType="separate"/>
       </w:r>
       <w:r>
-        <w:t>29</w:t>
+        <w:t>32</w:t>
       </w:r>
       <w:r>
         <w:fldChar w:fldCharType="end"/>
@@ -3204,7 +3206,7 @@
         <w:fldChar w:fldCharType="separate"/>
       </w:r>
       <w:r>
-        <w:t>29</w:t>
+        <w:t>32</w:t>
       </w:r>
       <w:r>
         <w:fldChar w:fldCharType="end"/>
@@ -3250,7 +3252,7 @@
         <w:fldChar w:fldCharType="separate"/>
       </w:r>
       <w:r>
-        <w:t>29</w:t>
+        <w:t>32</w:t>
       </w:r>
       <w:r>
         <w:fldChar w:fldCharType="end"/>
@@ -3296,7 +3298,7 @@
         <w:fldChar w:fldCharType="separate"/>
       </w:r>
       <w:r>
-        <w:t>30</w:t>
+        <w:t>33</w:t>
       </w:r>
       <w:r>
         <w:fldChar w:fldCharType="end"/>
@@ -3342,7 +3344,7 @@
         <w:fldChar w:fldCharType="separate"/>
       </w:r>
       <w:r>
-        <w:t>31</w:t>
+        <w:t>34</w:t>
       </w:r>
       <w:r>
         <w:fldChar w:fldCharType="end"/>
@@ -3388,7 +3390,7 @@
         <w:fldChar w:fldCharType="separate"/>
       </w:r>
       <w:r>
-        <w:t>31</w:t>
+        <w:t>34</w:t>
       </w:r>
       <w:r>
         <w:fldChar w:fldCharType="end"/>
@@ -3434,7 +3436,7 @@
         <w:fldChar w:fldCharType="separate"/>
       </w:r>
       <w:r>
-        <w:t>31</w:t>
+        <w:t>34</w:t>
       </w:r>
       <w:r>
         <w:fldChar w:fldCharType="end"/>
@@ -3480,7 +3482,7 @@
         <w:fldChar w:fldCharType="separate"/>
       </w:r>
       <w:r>
-        <w:t>31</w:t>
+        <w:t>34</w:t>
       </w:r>
       <w:r>
         <w:fldChar w:fldCharType="end"/>
@@ -3526,7 +3528,7 @@
         <w:fldChar w:fldCharType="separate"/>
       </w:r>
       <w:r>
-        <w:t>31</w:t>
+        <w:t>34</w:t>
       </w:r>
       <w:r>
         <w:fldChar w:fldCharType="end"/>
@@ -3572,7 +3574,7 @@
         <w:fldChar w:fldCharType="separate"/>
       </w:r>
       <w:r>
-        <w:t>32</w:t>
+        <w:t>35</w:t>
       </w:r>
       <w:r>
         <w:fldChar w:fldCharType="end"/>
@@ -3618,7 +3620,7 @@
         <w:fldChar w:fldCharType="separate"/>
       </w:r>
       <w:r>
-        <w:t>34</w:t>
+        <w:t>37</w:t>
       </w:r>
       <w:r>
         <w:fldChar w:fldCharType="end"/>
@@ -3664,7 +3666,7 @@
         <w:fldChar w:fldCharType="separate"/>
       </w:r>
       <w:r>
-        <w:t>35</w:t>
+        <w:t>38</w:t>
       </w:r>
       <w:r>
         <w:fldChar w:fldCharType="end"/>
@@ -3710,7 +3712,7 @@
         <w:fldChar w:fldCharType="separate"/>
       </w:r>
       <w:r>
-        <w:t>36</w:t>
+        <w:t>39</w:t>
       </w:r>
       <w:r>
         <w:fldChar w:fldCharType="end"/>
@@ -3756,7 +3758,7 @@
         <w:fldChar w:fldCharType="separate"/>
       </w:r>
       <w:r>
-        <w:t>36</w:t>
+        <w:t>39</w:t>
       </w:r>
       <w:r>
         <w:fldChar w:fldCharType="end"/>
@@ -3802,7 +3804,7 @@
         <w:fldChar w:fldCharType="separate"/>
       </w:r>
       <w:r>
-        <w:t>37</w:t>
+        <w:t>40</w:t>
       </w:r>
       <w:r>
         <w:fldChar w:fldCharType="end"/>
@@ -3848,7 +3850,7 @@
         <w:fldChar w:fldCharType="separate"/>
       </w:r>
       <w:r>
-        <w:t>37</w:t>
+        <w:t>40</w:t>
       </w:r>
       <w:r>
         <w:fldChar w:fldCharType="end"/>
@@ -3894,7 +3896,7 @@
         <w:fldChar w:fldCharType="separate"/>
       </w:r>
       <w:r>
-        <w:t>38</w:t>
+        <w:t>41</w:t>
       </w:r>
       <w:r>
         <w:fldChar w:fldCharType="end"/>
@@ -3940,7 +3942,7 @@
         <w:fldChar w:fldCharType="separate"/>
       </w:r>
       <w:r>
-        <w:t>38</w:t>
+        <w:t>41</w:t>
       </w:r>
       <w:r>
         <w:fldChar w:fldCharType="end"/>
@@ -3986,7 +3988,7 @@
         <w:fldChar w:fldCharType="separate"/>
       </w:r>
       <w:r>
-        <w:t>38</w:t>
+        <w:t>41</w:t>
       </w:r>
       <w:r>
         <w:fldChar w:fldCharType="end"/>
@@ -4590,6 +4592,14 @@
         <w:gridCol w:w="1665"/>
       </w:tblGrid>
       <w:tr>
+        <w:tblPrEx>
+          <w:tblCellMar>
+            <w:top w:w="0" w:type="dxa"/>
+            <w:left w:w="108" w:type="dxa"/>
+            <w:bottom w:w="0" w:type="dxa"/>
+            <w:right w:w="108" w:type="dxa"/>
+          </w:tblCellMar>
+        </w:tblPrEx>
         <w:trPr>
           <w:tblHeader/>
         </w:trPr>
@@ -5220,8 +5230,8 @@
           <w:szCs w:val="24"/>
         </w:rPr>
       </w:pPr>
-      <w:bookmarkStart w:id="23" w:name="_Toc2746"/>
-      <w:bookmarkStart w:id="24" w:name="_Toc24568"/>
+      <w:bookmarkStart w:id="23" w:name="_Toc24568"/>
+      <w:bookmarkStart w:id="24" w:name="_Toc2746"/>
       <w:bookmarkStart w:id="25" w:name="chương-2-công-nghệ-và-kiến-trúc-hệ-thống"/>
       <w:r>
         <w:rPr>
@@ -5854,8 +5864,8 @@
           <w:szCs w:val="24"/>
         </w:rPr>
       </w:pPr>
-      <w:bookmarkStart w:id="29" w:name="_Toc1316"/>
-      <w:bookmarkStart w:id="30" w:name="_Toc326"/>
+      <w:bookmarkStart w:id="29" w:name="_Toc326"/>
+      <w:bookmarkStart w:id="30" w:name="_Toc1316"/>
       <w:bookmarkStart w:id="31" w:name="Xe85055f62408fd09ef210278cf976cd44941ca4"/>
       <w:r>
         <w:rPr>
@@ -6673,8 +6683,8 @@
           <w:szCs w:val="24"/>
         </w:rPr>
       </w:pPr>
-      <w:bookmarkStart w:id="32" w:name="_Toc25809"/>
-      <w:bookmarkStart w:id="33" w:name="_Toc27500"/>
+      <w:bookmarkStart w:id="32" w:name="_Toc27500"/>
+      <w:bookmarkStart w:id="33" w:name="_Toc25809"/>
       <w:bookmarkStart w:id="34" w:name="cấu-trúc-package-backend"/>
       <w:r>
         <w:rPr>
@@ -15878,8 +15888,8 @@
           <w:szCs w:val="24"/>
         </w:rPr>
       </w:pPr>
-      <w:bookmarkStart w:id="54" w:name="_Toc15322"/>
-      <w:bookmarkStart w:id="55" w:name="_Toc22766"/>
+      <w:bookmarkStart w:id="54" w:name="_Toc22766"/>
+      <w:bookmarkStart w:id="55" w:name="_Toc15322"/>
       <w:bookmarkStart w:id="56" w:name="trừu-tượng-abstraction"/>
       <w:r>
         <w:rPr>
@@ -16059,8 +16069,8 @@
           <w:szCs w:val="24"/>
         </w:rPr>
       </w:pPr>
-      <w:bookmarkStart w:id="57" w:name="_Toc27032"/>
-      <w:bookmarkStart w:id="58" w:name="_Toc5349"/>
+      <w:bookmarkStart w:id="57" w:name="_Toc5349"/>
+      <w:bookmarkStart w:id="58" w:name="_Toc27032"/>
       <w:bookmarkStart w:id="59" w:name="bảng-tổng-hợp-áp-dụng-4-trụ-cột-oop"/>
       <w:r>
         <w:rPr>
@@ -17157,6 +17167,14 @@
         </w:tc>
       </w:tr>
       <w:tr>
+        <w:tblPrEx>
+          <w:tblCellMar>
+            <w:top w:w="0" w:type="dxa"/>
+            <w:left w:w="108" w:type="dxa"/>
+            <w:bottom w:w="0" w:type="dxa"/>
+            <w:right w:w="108" w:type="dxa"/>
+          </w:tblCellMar>
+        </w:tblPrEx>
         <w:tc>
           <w:tcPr>
             <w:tcW w:w="2084" w:type="dxa"/>
@@ -18144,8 +18162,8 @@
           <w:szCs w:val="24"/>
         </w:rPr>
       </w:pPr>
-      <w:bookmarkStart w:id="66" w:name="_Toc7877"/>
-      <w:bookmarkStart w:id="67" w:name="_Toc27843"/>
+      <w:bookmarkStart w:id="66" w:name="_Toc27843"/>
+      <w:bookmarkStart w:id="67" w:name="_Toc7877"/>
       <w:bookmarkStart w:id="68" w:name="chi-tiết-các-nhóm-chức-năng-chính"/>
       <w:r>
         <w:rPr>
@@ -18394,8 +18412,8 @@
           <w:szCs w:val="24"/>
         </w:rPr>
       </w:pPr>
-      <w:bookmarkStart w:id="69" w:name="_Toc12957"/>
-      <w:bookmarkStart w:id="70" w:name="_Toc28967"/>
+      <w:bookmarkStart w:id="69" w:name="_Toc28967"/>
+      <w:bookmarkStart w:id="70" w:name="_Toc12957"/>
       <w:bookmarkStart w:id="71" w:name="mô-tả-giao-diện-người-dùng"/>
       <w:r>
         <w:rPr>
@@ -18412,9 +18430,6 @@
       <w:pPr>
         <w:pStyle w:val="30"/>
         <w:spacing w:line="360" w:lineRule="auto"/>
-        <w:rPr>
-          <w:rFonts w:ascii="Times New Roman" w:hAnsi="Times New Roman" w:cs="Times New Roman"/>
-        </w:rPr>
       </w:pPr>
       <w:r>
         <w:rPr>
@@ -18427,15 +18442,133 @@
           <w:rFonts w:ascii="Times New Roman" w:hAnsi="Times New Roman" w:cs="Times New Roman"/>
         </w:rPr>
         <w:br w:type="textWrapping"/>
+      </w:r>
+      <w:r>
+        <w:drawing>
+          <wp:inline distT="0" distB="0" distL="114300" distR="114300">
+            <wp:extent cx="5932170" cy="3191510"/>
+            <wp:effectExtent l="0" t="0" r="1905" b="8890"/>
+            <wp:docPr id="2" name="Picture 10"/>
+            <wp:cNvGraphicFramePr>
+              <a:graphicFrameLocks xmlns:a="http://schemas.openxmlformats.org/drawingml/2006/main" noChangeAspect="1"/>
+            </wp:cNvGraphicFramePr>
+            <a:graphic xmlns:a="http://schemas.openxmlformats.org/drawingml/2006/main">
+              <a:graphicData uri="http://schemas.openxmlformats.org/drawingml/2006/picture">
+                <pic:pic xmlns:pic="http://schemas.openxmlformats.org/drawingml/2006/picture">
+                  <pic:nvPicPr>
+                    <pic:cNvPr id="2" name="Picture 10"/>
+                    <pic:cNvPicPr>
+                      <a:picLocks noChangeAspect="1"/>
+                    </pic:cNvPicPr>
+                  </pic:nvPicPr>
+                  <pic:blipFill>
+                    <a:blip r:embed="rId9"/>
+                    <a:stretch>
+                      <a:fillRect/>
+                    </a:stretch>
+                  </pic:blipFill>
+                  <pic:spPr>
+                    <a:xfrm>
+                      <a:off x="0" y="0"/>
+                      <a:ext cx="5932170" cy="3191510"/>
+                    </a:xfrm>
+                    <a:prstGeom prst="rect">
+                      <a:avLst/>
+                    </a:prstGeom>
+                    <a:noFill/>
+                    <a:ln>
+                      <a:noFill/>
+                    </a:ln>
+                  </pic:spPr>
+                </pic:pic>
+              </a:graphicData>
+            </a:graphic>
+          </wp:inline>
+        </w:drawing>
       </w:r>
     </w:p>
     <w:p>
       <w:pPr>
+        <w:pStyle w:val="3"/>
+        <w:ind w:firstLine="720" w:firstLineChars="300"/>
+      </w:pPr>
+      <w:r>
+        <w:rPr>
+          <w:rFonts w:ascii="Times New Roman" w:hAnsi="Times New Roman" w:cs="Times New Roman"/>
+          <w:i/>
+          <w:iCs/>
+        </w:rPr>
+        <w:t>Hình 4.1: Giao diện trang chủ DynamicHeroBanner và danh sách chuyến xe cao tốc 5B.</w:t>
+      </w:r>
+    </w:p>
+    <w:p>
+      <w:pPr>
         <w:numPr>
-          <w:ilvl w:val="0"/>
-          <w:numId w:val="2"/>
+          <w:numId w:val="0"/>
         </w:numPr>
         <w:spacing w:line="360" w:lineRule="auto"/>
+        <w:ind w:left="480" w:leftChars="0"/>
+        <w:rPr>
+          <w:rFonts w:ascii="Times New Roman" w:hAnsi="Times New Roman" w:cs="Times New Roman"/>
+        </w:rPr>
+      </w:pPr>
+      <w:r>
+        <w:rPr>
+          <w:rFonts w:ascii="Times New Roman" w:hAnsi="Times New Roman" w:cs="Times New Roman"/>
+        </w:rPr>
+        <w:br w:type="textWrapping"/>
+      </w:r>
+      <w:r>
+        <w:drawing>
+          <wp:inline distT="0" distB="0" distL="114300" distR="114300">
+            <wp:extent cx="5939790" cy="6940550"/>
+            <wp:effectExtent l="0" t="0" r="3810" b="3175"/>
+            <wp:docPr id="4" name="Picture 11"/>
+            <wp:cNvGraphicFramePr>
+              <a:graphicFrameLocks xmlns:a="http://schemas.openxmlformats.org/drawingml/2006/main" noChangeAspect="1"/>
+            </wp:cNvGraphicFramePr>
+            <a:graphic xmlns:a="http://schemas.openxmlformats.org/drawingml/2006/main">
+              <a:graphicData uri="http://schemas.openxmlformats.org/drawingml/2006/picture">
+                <pic:pic xmlns:pic="http://schemas.openxmlformats.org/drawingml/2006/picture">
+                  <pic:nvPicPr>
+                    <pic:cNvPr id="4" name="Picture 11"/>
+                    <pic:cNvPicPr>
+                      <a:picLocks noChangeAspect="1"/>
+                    </pic:cNvPicPr>
+                  </pic:nvPicPr>
+                  <pic:blipFill>
+                    <a:blip r:embed="rId10"/>
+                    <a:stretch>
+                      <a:fillRect/>
+                    </a:stretch>
+                  </pic:blipFill>
+                  <pic:spPr>
+                    <a:xfrm>
+                      <a:off x="0" y="0"/>
+                      <a:ext cx="5939790" cy="6940550"/>
+                    </a:xfrm>
+                    <a:prstGeom prst="rect">
+                      <a:avLst/>
+                    </a:prstGeom>
+                    <a:noFill/>
+                    <a:ln>
+                      <a:noFill/>
+                    </a:ln>
+                  </pic:spPr>
+                </pic:pic>
+              </a:graphicData>
+            </a:graphic>
+          </wp:inline>
+        </w:drawing>
+      </w:r>
+    </w:p>
+    <w:p>
+      <w:pPr>
+        <w:numPr>
+          <w:numId w:val="0"/>
+        </w:numPr>
+        <w:spacing w:line="360" w:lineRule="auto"/>
+        <w:ind w:left="480" w:leftChars="0" w:firstLine="720" w:firstLineChars="300"/>
         <w:rPr>
           <w:rFonts w:ascii="Times New Roman" w:hAnsi="Times New Roman" w:cs="Times New Roman"/>
         </w:rPr>
@@ -18446,7 +18579,7 @@
           <w:i/>
           <w:iCs/>
         </w:rPr>
-        <w:t>Hình 4.1: Giao diện trang chủ DynamicHeroBanner và danh sách chuyến xe cao tốc 5B.</w:t>
+        <w:t>Hình 4.2: Sơ đồ chọn ghế trực quan xe Limousine 12 chỗ (phân biệt màu ghế trống, đang giữ và đã bán).</w:t>
       </w:r>
       <w:r>
         <w:rPr>
@@ -18458,8 +18591,7 @@
     <w:p>
       <w:pPr>
         <w:numPr>
-          <w:ilvl w:val="0"/>
-          <w:numId w:val="2"/>
+          <w:numId w:val="0"/>
         </w:numPr>
         <w:spacing w:line="360" w:lineRule="auto"/>
         <w:rPr>
@@ -18467,12 +18599,67 @@
         </w:rPr>
       </w:pPr>
       <w:r>
+        <w:drawing>
+          <wp:inline distT="0" distB="0" distL="114300" distR="114300">
+            <wp:extent cx="5940425" cy="5186680"/>
+            <wp:effectExtent l="0" t="0" r="3175" b="4445"/>
+            <wp:docPr id="5" name="Picture 12"/>
+            <wp:cNvGraphicFramePr>
+              <a:graphicFrameLocks xmlns:a="http://schemas.openxmlformats.org/drawingml/2006/main" noChangeAspect="1"/>
+            </wp:cNvGraphicFramePr>
+            <a:graphic xmlns:a="http://schemas.openxmlformats.org/drawingml/2006/main">
+              <a:graphicData uri="http://schemas.openxmlformats.org/drawingml/2006/picture">
+                <pic:pic xmlns:pic="http://schemas.openxmlformats.org/drawingml/2006/picture">
+                  <pic:nvPicPr>
+                    <pic:cNvPr id="5" name="Picture 12"/>
+                    <pic:cNvPicPr>
+                      <a:picLocks noChangeAspect="1"/>
+                    </pic:cNvPicPr>
+                  </pic:nvPicPr>
+                  <pic:blipFill>
+                    <a:blip r:embed="rId11"/>
+                    <a:stretch>
+                      <a:fillRect/>
+                    </a:stretch>
+                  </pic:blipFill>
+                  <pic:spPr>
+                    <a:xfrm>
+                      <a:off x="0" y="0"/>
+                      <a:ext cx="5940425" cy="5186680"/>
+                    </a:xfrm>
+                    <a:prstGeom prst="rect">
+                      <a:avLst/>
+                    </a:prstGeom>
+                    <a:noFill/>
+                    <a:ln>
+                      <a:noFill/>
+                    </a:ln>
+                  </pic:spPr>
+                </pic:pic>
+              </a:graphicData>
+            </a:graphic>
+          </wp:inline>
+        </w:drawing>
+      </w:r>
+    </w:p>
+    <w:p>
+      <w:pPr>
+        <w:numPr>
+          <w:numId w:val="0"/>
+        </w:numPr>
+        <w:spacing w:line="360" w:lineRule="auto"/>
+        <w:ind w:left="480" w:leftChars="0"/>
+        <w:rPr>
+          <w:rFonts w:ascii="Times New Roman" w:hAnsi="Times New Roman" w:cs="Times New Roman"/>
+        </w:rPr>
+      </w:pPr>
+      <w:r>
         <w:rPr>
           <w:rFonts w:ascii="Times New Roman" w:hAnsi="Times New Roman" w:cs="Times New Roman"/>
           <w:i/>
           <w:iCs/>
         </w:rPr>
-        <w:t>Hình 4.2: Sơ đồ chọn ghế trực quan xe Limousine 12 chỗ (phân biệt màu ghế trống, đang giữ và đã bán).</w:t>
+        <w:t>Hình 4.3: Modal giữ chỗ tự động 3 phút và áp dụng chiết khấu khách VIP (-20%).</w:t>
       </w:r>
       <w:r>
         <w:rPr>
@@ -18484,27 +18671,56 @@
     <w:p>
       <w:pPr>
         <w:numPr>
-          <w:ilvl w:val="0"/>
-          <w:numId w:val="2"/>
+          <w:numId w:val="0"/>
         </w:numPr>
         <w:spacing w:line="360" w:lineRule="auto"/>
-        <w:rPr>
-          <w:rFonts w:ascii="Times New Roman" w:hAnsi="Times New Roman" w:cs="Times New Roman"/>
-        </w:rPr>
-      </w:pPr>
-      <w:r>
-        <w:rPr>
-          <w:rFonts w:ascii="Times New Roman" w:hAnsi="Times New Roman" w:cs="Times New Roman"/>
-          <w:i/>
-          <w:iCs/>
-        </w:rPr>
-        <w:t>Hình 4.3: Modal giữ chỗ tự động 3 phút và áp dụng chiết khấu khách VIP (-20%).</w:t>
-      </w:r>
-      <w:r>
-        <w:rPr>
-          <w:rFonts w:ascii="Times New Roman" w:hAnsi="Times New Roman" w:cs="Times New Roman"/>
-        </w:rPr>
-        <w:br w:type="textWrapping"/>
+        <w:ind w:left="480" w:leftChars="0"/>
+        <w:rPr>
+          <w:rFonts w:ascii="Times New Roman" w:hAnsi="Times New Roman" w:cs="Times New Roman"/>
+        </w:rPr>
+      </w:pPr>
+      <w:r>
+        <w:drawing>
+          <wp:inline distT="0" distB="0" distL="114300" distR="114300">
+            <wp:extent cx="5939790" cy="5419725"/>
+            <wp:effectExtent l="0" t="0" r="3810" b="0"/>
+            <wp:docPr id="6" name="Picture 13"/>
+            <wp:cNvGraphicFramePr>
+              <a:graphicFrameLocks xmlns:a="http://schemas.openxmlformats.org/drawingml/2006/main" noChangeAspect="1"/>
+            </wp:cNvGraphicFramePr>
+            <a:graphic xmlns:a="http://schemas.openxmlformats.org/drawingml/2006/main">
+              <a:graphicData uri="http://schemas.openxmlformats.org/drawingml/2006/picture">
+                <pic:pic xmlns:pic="http://schemas.openxmlformats.org/drawingml/2006/picture">
+                  <pic:nvPicPr>
+                    <pic:cNvPr id="6" name="Picture 13"/>
+                    <pic:cNvPicPr>
+                      <a:picLocks noChangeAspect="1"/>
+                    </pic:cNvPicPr>
+                  </pic:nvPicPr>
+                  <pic:blipFill>
+                    <a:blip r:embed="rId12"/>
+                    <a:stretch>
+                      <a:fillRect/>
+                    </a:stretch>
+                  </pic:blipFill>
+                  <pic:spPr>
+                    <a:xfrm>
+                      <a:off x="0" y="0"/>
+                      <a:ext cx="5939790" cy="5419725"/>
+                    </a:xfrm>
+                    <a:prstGeom prst="rect">
+                      <a:avLst/>
+                    </a:prstGeom>
+                    <a:noFill/>
+                    <a:ln>
+                      <a:noFill/>
+                    </a:ln>
+                  </pic:spPr>
+                </pic:pic>
+              </a:graphicData>
+            </a:graphic>
+          </wp:inline>
+        </w:drawing>
       </w:r>
     </w:p>
     <w:p>
@@ -18587,8 +18803,8 @@
           <w:szCs w:val="24"/>
         </w:rPr>
       </w:pPr>
-      <w:bookmarkStart w:id="75" w:name="_Toc17110"/>
-      <w:bookmarkStart w:id="76" w:name="_Toc13799"/>
+      <w:bookmarkStart w:id="75" w:name="_Toc13799"/>
+      <w:bookmarkStart w:id="76" w:name="_Toc17110"/>
       <w:bookmarkStart w:id="77" w:name="X11db02093a5a40570fb5c8970ee07d369dea759"/>
       <w:r>
         <w:rPr>
@@ -18763,6 +18979,8 @@
             </m:rPr>
             <w:rPr>
               <w:rFonts w:ascii="Times New Roman" w:hAnsi="Times New Roman" w:cs="Times New Roman"/>
+              <w:b w:val="0"/>
+              <w:i w:val="0"/>
             </w:rPr>
             <m:t>Giá cuối=(Giá cơ bản+Phụ phí VIP)-Mức giảm giá đa hình</m:t>
           </m:r>
@@ -19116,7 +19334,7 @@
                     </pic:cNvPicPr>
                   </pic:nvPicPr>
                   <pic:blipFill>
-                    <a:blip r:embed="rId9"/>
+                    <a:blip r:embed="rId13"/>
                     <a:stretch>
                       <a:fillRect/>
                     </a:stretch>
@@ -19604,8 +19822,8 @@
           <w:szCs w:val="24"/>
         </w:rPr>
       </w:pPr>
-      <w:bookmarkStart w:id="84" w:name="_Toc26884"/>
-      <w:bookmarkStart w:id="85" w:name="_Toc14676"/>
+      <w:bookmarkStart w:id="84" w:name="_Toc14676"/>
+      <w:bookmarkStart w:id="85" w:name="_Toc26884"/>
       <w:r>
         <w:rPr>
           <w:rStyle w:val="39"/>
@@ -19900,8 +20118,8 @@
           <w:szCs w:val="24"/>
         </w:rPr>
       </w:pPr>
-      <w:bookmarkStart w:id="92" w:name="_Toc10468"/>
-      <w:bookmarkStart w:id="93" w:name="_Toc25253"/>
+      <w:bookmarkStart w:id="92" w:name="_Toc25253"/>
+      <w:bookmarkStart w:id="93" w:name="_Toc10468"/>
       <w:bookmarkStart w:id="94" w:name="cấu-hình-cors"/>
       <w:r>
         <w:rPr>
@@ -20657,8 +20875,8 @@
           <w:szCs w:val="24"/>
         </w:rPr>
       </w:pPr>
-      <w:bookmarkStart w:id="95" w:name="_Toc12602"/>
-      <w:bookmarkStart w:id="96" w:name="_Toc1418"/>
+      <w:bookmarkStart w:id="95" w:name="_Toc1418"/>
+      <w:bookmarkStart w:id="96" w:name="_Toc12602"/>
       <w:bookmarkStart w:id="97" w:name="xử-lý-ngoại-lệ-và-mã-lỗi-http"/>
       <w:r>
         <w:rPr>
@@ -21056,6 +21274,14 @@
         </w:tc>
       </w:tr>
       <w:tr>
+        <w:tblPrEx>
+          <w:tblCellMar>
+            <w:top w:w="0" w:type="dxa"/>
+            <w:left w:w="108" w:type="dxa"/>
+            <w:bottom w:w="0" w:type="dxa"/>
+            <w:right w:w="108" w:type="dxa"/>
+          </w:tblCellMar>
+        </w:tblPrEx>
         <w:tc>
           <w:tcPr>
             <w:tcW w:w="2084" w:type="dxa"/>
@@ -22290,8 +22516,8 @@
           <w:szCs w:val="24"/>
         </w:rPr>
       </w:pPr>
-      <w:bookmarkStart w:id="98" w:name="_Toc30705"/>
-      <w:bookmarkStart w:id="99" w:name="_Toc24043"/>
+      <w:bookmarkStart w:id="98" w:name="_Toc24043"/>
+      <w:bookmarkStart w:id="99" w:name="_Toc30705"/>
       <w:bookmarkStart w:id="100" w:name="X3ecf2a30f701cf91bf0d72e5421e145a61d8bd3"/>
       <w:r>
         <w:rPr>
@@ -23180,8 +23406,8 @@
           <w:szCs w:val="24"/>
         </w:rPr>
       </w:pPr>
-      <w:bookmarkStart w:id="103" w:name="_Toc6128"/>
-      <w:bookmarkStart w:id="104" w:name="_Toc29161"/>
+      <w:bookmarkStart w:id="103" w:name="_Toc29161"/>
+      <w:bookmarkStart w:id="104" w:name="_Toc6128"/>
       <w:bookmarkStart w:id="105" w:name="chiến-lược-sinh-mã-định-danh-id"/>
       <w:r>
         <w:rPr>
@@ -24531,8 +24757,8 @@
           <w:szCs w:val="24"/>
         </w:rPr>
       </w:pPr>
-      <w:bookmarkStart w:id="121" w:name="_Toc26819"/>
-      <w:bookmarkStart w:id="122" w:name="_Toc6400"/>
+      <w:bookmarkStart w:id="121" w:name="_Toc6400"/>
+      <w:bookmarkStart w:id="122" w:name="_Toc26819"/>
       <w:bookmarkStart w:id="123" w:name="giới-hạn-khi-vận-hành-thực-tế"/>
       <w:r>
         <w:rPr>
@@ -24635,8 +24861,8 @@
           <w:szCs w:val="24"/>
         </w:rPr>
       </w:pPr>
-      <w:bookmarkStart w:id="124" w:name="_Toc5388"/>
-      <w:bookmarkStart w:id="125" w:name="_Toc7344"/>
+      <w:bookmarkStart w:id="124" w:name="_Toc7344"/>
+      <w:bookmarkStart w:id="125" w:name="_Toc5388"/>
       <w:bookmarkStart w:id="126" w:name="chương-8-kiểm-thử-và-kịch-bản-test"/>
       <w:r>
         <w:rPr>
@@ -25433,8 +25659,8 @@
           <w:szCs w:val="24"/>
         </w:rPr>
       </w:pPr>
-      <w:bookmarkStart w:id="136" w:name="_Toc10007"/>
-      <w:bookmarkStart w:id="137" w:name="_Toc329"/>
+      <w:bookmarkStart w:id="136" w:name="_Toc329"/>
+      <w:bookmarkStart w:id="137" w:name="_Toc10007"/>
       <w:bookmarkStart w:id="138" w:name="các-tình-huống-test-chi-tiết"/>
       <w:r>
         <w:rPr>
@@ -26726,6 +26952,8 @@
           </m:rPr>
           <w:rPr>
             <w:rFonts w:ascii="Times New Roman" w:hAnsi="Times New Roman" w:cs="Times New Roman"/>
+            <w:b w:val="0"/>
+            <w:i w:val="0"/>
           </w:rPr>
           <m:t>→</m:t>
         </m:r>
@@ -26784,6 +27012,8 @@
           </m:rPr>
           <w:rPr>
             <w:rFonts w:ascii="Times New Roman" w:hAnsi="Times New Roman" w:cs="Times New Roman"/>
+            <w:b w:val="0"/>
+            <w:i w:val="0"/>
           </w:rPr>
           <m:t>280.000-(280.000×20%)=224.000VNĐ</m:t>
         </m:r>
@@ -26821,6 +27051,8 @@
           </m:rPr>
           <w:rPr>
             <w:rFonts w:ascii="Times New Roman" w:hAnsi="Times New Roman" w:cs="Times New Roman"/>
+            <w:b w:val="0"/>
+            <w:i w:val="0"/>
           </w:rPr>
           <m:t>280.000-(280.000×10%)=252.000VNĐ</m:t>
         </m:r>
@@ -27942,8 +28174,8 @@
         </w:rPr>
         <w:t xml:space="preserve"> </w:t>
       </w:r>
-      <w:bookmarkStart w:id="147" w:name="_Toc5567"/>
-      <w:bookmarkStart w:id="148" w:name="_Toc970"/>
+      <w:bookmarkStart w:id="147" w:name="_Toc970"/>
+      <w:bookmarkStart w:id="148" w:name="_Toc5567"/>
       <w:r>
         <w:rPr>
           <w:rFonts w:ascii="Times New Roman" w:hAnsi="Times New Roman" w:cs="Times New Roman"/>
@@ -31114,18 +31346,7 @@
                 <w:bCs/>
                 <w:lang w:val="vi-VN"/>
               </w:rPr>
-              <w:t>Báo cáo,</w:t>
-            </w:r>
-            <w:bookmarkStart w:id="170" w:name="_GoBack"/>
-            <w:bookmarkEnd w:id="170"/>
-            <w:r>
-              <w:rPr>
-                <w:rFonts w:hint="default" w:ascii="Times New Roman" w:hAnsi="Times New Roman" w:cs="Times New Roman"/>
-                <w:b/>
-                <w:bCs/>
-                <w:lang w:val="vi-VN"/>
-              </w:rPr>
-              <w:t xml:space="preserve"> h</w:t>
+              <w:t>Báo cáo, h</w:t>
             </w:r>
             <w:r>
               <w:rPr>
@@ -31314,7 +31535,7 @@
     <w:sdtPr>
       <w:id w:val="1187244250"/>
       <w:docPartObj>
-        <w:docPartGallery w:val="AutoText"/>
+        <w:docPartGallery w:val="autotext"/>
       </w:docPartObj>
     </w:sdtPr>
     <w:sdtContent>
@@ -31355,7 +31576,7 @@
     <w:sdtPr>
       <w:id w:val="-1450078788"/>
       <w:docPartObj>
-        <w:docPartGallery w:val="AutoText"/>
+        <w:docPartGallery w:val="autotext"/>
       </w:docPartObj>
     </w:sdtPr>
     <w:sdtContent>
@@ -31902,14 +32123,14 @@
     <w:lsdException w:unhideWhenUsed="0" w:uiPriority="0" w:semiHidden="0" w:name="Normal Indent"/>
     <w:lsdException w:qFormat="1" w:uiPriority="9" w:semiHidden="0" w:name="footnote text"/>
     <w:lsdException w:unhideWhenUsed="0" w:uiPriority="0" w:semiHidden="0" w:name="annotation text"/>
-    <w:lsdException w:unhideWhenUsed="0" w:uiPriority="0" w:semiHidden="0" w:name="header"/>
+    <w:lsdException w:qFormat="1" w:unhideWhenUsed="0" w:uiPriority="0" w:semiHidden="0" w:name="header"/>
     <w:lsdException w:unhideWhenUsed="0" w:uiPriority="99" w:semiHidden="0" w:name="footer"/>
     <w:lsdException w:unhideWhenUsed="0" w:uiPriority="0" w:semiHidden="0" w:name="index heading"/>
-    <w:lsdException w:unhideWhenUsed="0" w:uiPriority="0" w:semiHidden="0" w:name="caption"/>
+    <w:lsdException w:qFormat="1" w:unhideWhenUsed="0" w:uiPriority="0" w:semiHidden="0" w:name="caption"/>
     <w:lsdException w:unhideWhenUsed="0" w:uiPriority="0" w:semiHidden="0" w:name="table of figures"/>
     <w:lsdException w:unhideWhenUsed="0" w:uiPriority="0" w:semiHidden="0" w:name="envelope address"/>
     <w:lsdException w:unhideWhenUsed="0" w:uiPriority="0" w:semiHidden="0" w:name="envelope return"/>
-    <w:lsdException w:unhideWhenUsed="0" w:uiPriority="0" w:semiHidden="0" w:name="footnote reference"/>
+    <w:lsdException w:qFormat="1" w:unhideWhenUsed="0" w:uiPriority="0" w:semiHidden="0" w:name="footnote reference"/>
     <w:lsdException w:unhideWhenUsed="0" w:uiPriority="0" w:semiHidden="0" w:name="annotation reference"/>
     <w:lsdException w:unhideWhenUsed="0" w:uiPriority="0" w:semiHidden="0" w:name="line number"/>
     <w:lsdException w:unhideWhenUsed="0" w:uiPriority="0" w:semiHidden="0" w:name="page number"/>
@@ -31936,7 +32157,7 @@
     <w:lsdException w:qFormat="1" w:unhideWhenUsed="0" w:uiPriority="10" w:semiHidden="0" w:name="Title"/>
     <w:lsdException w:unhideWhenUsed="0" w:uiPriority="0" w:semiHidden="0" w:name="Closing"/>
     <w:lsdException w:unhideWhenUsed="0" w:uiPriority="0" w:semiHidden="0" w:name="Signature"/>
-    <w:lsdException w:uiPriority="1" w:name="Default Paragraph Font"/>
+    <w:lsdException w:qFormat="1" w:uiPriority="1" w:name="Default Paragraph Font"/>
     <w:lsdException w:qFormat="1" w:unhideWhenUsed="0" w:uiPriority="0" w:semiHidden="0" w:name="Body Text"/>
     <w:lsdException w:unhideWhenUsed="0" w:uiPriority="0" w:semiHidden="0" w:name="Body Text Indent"/>
     <w:lsdException w:unhideWhenUsed="0" w:uiPriority="0" w:semiHidden="0" w:name="List Continue"/>
@@ -31956,14 +32177,14 @@
     <w:lsdException w:unhideWhenUsed="0" w:uiPriority="0" w:semiHidden="0" w:name="Body Text Indent 2"/>
     <w:lsdException w:unhideWhenUsed="0" w:uiPriority="0" w:semiHidden="0" w:name="Body Text Indent 3"/>
     <w:lsdException w:qFormat="1" w:uiPriority="9" w:semiHidden="0" w:name="Block Text"/>
-    <w:lsdException w:unhideWhenUsed="0" w:uiPriority="0" w:semiHidden="0" w:name="Hyperlink"/>
+    <w:lsdException w:qFormat="1" w:unhideWhenUsed="0" w:uiPriority="0" w:semiHidden="0" w:name="Hyperlink"/>
     <w:lsdException w:unhideWhenUsed="0" w:uiPriority="0" w:semiHidden="0" w:name="FollowedHyperlink"/>
     <w:lsdException w:unhideWhenUsed="0" w:uiPriority="0" w:semiHidden="0" w:name="Strong"/>
     <w:lsdException w:unhideWhenUsed="0" w:uiPriority="0" w:semiHidden="0" w:name="Emphasis"/>
     <w:lsdException w:unhideWhenUsed="0" w:uiPriority="0" w:semiHidden="0" w:name="Document Map"/>
     <w:lsdException w:unhideWhenUsed="0" w:uiPriority="0" w:semiHidden="0" w:name="Plain Text"/>
     <w:lsdException w:unhideWhenUsed="0" w:uiPriority="0" w:semiHidden="0" w:name="E-mail Signature"/>
-    <w:lsdException w:unhideWhenUsed="0" w:uiPriority="0" w:semiHidden="0" w:name="Normal (Web)"/>
+    <w:lsdException w:qFormat="1" w:unhideWhenUsed="0" w:uiPriority="0" w:semiHidden="0" w:name="Normal (Web)"/>
     <w:lsdException w:unhideWhenUsed="0" w:uiPriority="0" w:semiHidden="0" w:name="HTML Acronym"/>
     <w:lsdException w:unhideWhenUsed="0" w:uiPriority="0" w:semiHidden="0" w:name="HTML Address"/>
     <w:lsdException w:unhideWhenUsed="0" w:uiPriority="0" w:semiHidden="0" w:name="HTML Cite"/>
@@ -31974,7 +32195,7 @@
     <w:lsdException w:unhideWhenUsed="0" w:uiPriority="0" w:semiHidden="0" w:name="HTML Sample"/>
     <w:lsdException w:unhideWhenUsed="0" w:uiPriority="0" w:semiHidden="0" w:name="HTML Typewriter"/>
     <w:lsdException w:unhideWhenUsed="0" w:uiPriority="0" w:semiHidden="0" w:name="HTML Variable"/>
-    <w:lsdException w:uiPriority="99" w:name="Normal Table"/>
+    <w:lsdException w:qFormat="1" w:uiPriority="99" w:name="Normal Table"/>
     <w:lsdException w:unhideWhenUsed="0" w:uiPriority="0" w:semiHidden="0" w:name="annotation subject"/>
     <w:lsdException w:uiPriority="0" w:name="Table Simple 1"/>
     <w:lsdException w:uiPriority="0" w:name="Table Simple 2"/>
@@ -32327,12 +32548,14 @@
     <w:name w:val="Default Paragraph Font"/>
     <w:semiHidden/>
     <w:unhideWhenUsed/>
+    <w:qFormat/>
     <w:uiPriority w:val="1"/>
   </w:style>
   <w:style w:type="table" w:default="1" w:styleId="13">
     <w:name w:val="Normal Table"/>
     <w:semiHidden/>
     <w:unhideWhenUsed/>
+    <w:qFormat/>
     <w:uiPriority w:val="99"/>
     <w:tblPr>
       <w:tblCellMar>
@@ -32368,6 +32591,7 @@
   <w:style w:type="paragraph" w:styleId="15">
     <w:name w:val="caption"/>
     <w:basedOn w:val="1"/>
+    <w:qFormat/>
     <w:uiPriority w:val="0"/>
     <w:pPr>
       <w:spacing w:after="120"/>
@@ -32425,6 +32649,7 @@
   <w:style w:type="character" w:styleId="19">
     <w:name w:val="footnote reference"/>
     <w:basedOn w:val="20"/>
+    <w:qFormat/>
     <w:uiPriority w:val="0"/>
     <w:rPr>
       <w:vertAlign w:val="superscript"/>
@@ -32448,6 +32673,7 @@
     <w:name w:val="header"/>
     <w:basedOn w:val="1"/>
     <w:link w:val="90"/>
+    <w:qFormat/>
     <w:uiPriority w:val="0"/>
     <w:pPr>
       <w:tabs>
@@ -32471,6 +32697,7 @@
   <w:style w:type="character" w:styleId="24">
     <w:name w:val="Hyperlink"/>
     <w:basedOn w:val="20"/>
+    <w:qFormat/>
     <w:uiPriority w:val="0"/>
     <w:rPr>
       <w:color w:val="156082" w:themeColor="accent1"/>
@@ -32478,6 +32705,7 @@
   </w:style>
   <w:style w:type="paragraph" w:styleId="25">
     <w:name w:val="Normal (Web)"/>
+    <w:qFormat/>
     <w:uiPriority w:val="0"/>
     <w:pPr>
       <w:spacing w:beforeAutospacing="1" w:afterAutospacing="1"/>

</xml_diff>